<commit_message>
Final report: remove unsupported case details
Co-Authored-By: Claude Opus 5.5 <noreply@anthropic.com>
Claude-Session: https://claude.ai/code/session_01DBZNZtEdAoJTdmQtwfGFDf
</commit_message>
<xml_diff>
--- a/OB_Final_Report.docx
+++ b/OB_Final_Report.docx
@@ -283,7 +283,7 @@
           <w:sz w:val="24"/>
           <w:szCs w:val="24"/>
         </w:rPr>
-        <w:t xml:space="preserve">So far I have only experienced small difficulties. I am typically German: punctual, conscientious and very direct in person. When a team agrees on a deadline and then submits late, that would rarely happen in Germany, and it frustrated me at first. I did not know that such differences can grow into serious problems for a whole company, up to a lost client and a threatened lawsuit. In a global company they cannot be avoided, but someone who is aware of them can have a real, positive influence. Greg raised customer satisfaction by 72% through process, presence and protection.</w:t>
+        <w:t xml:space="preserve">So far I have only experienced small difficulties. I am typically German: punctual, conscientious and very direct in person. When a team agrees on a deadline and then submits late, that would rarely happen in Germany, and it frustrated me at first. I did not know that such differences can grow into serious problems for a whole company, up to a furious client and a threatened lawsuit. In a global company they cannot be avoided, but someone who is aware of them can have a real, positive influence.</w:t>
       </w:r>
     </w:p>
     <w:p>
@@ -427,7 +427,7 @@
           <w:sz w:val="24"/>
           <w:szCs w:val="24"/>
         </w:rPr>
-        <w:t xml:space="preserve">Edmondson's spectrum of failure showed me that the error itself is often not the real damage. The damage comes from not admitting it: every week of carrying on adds time, money and credibility to a decision that is already wrong.</w:t>
+        <w:t xml:space="preserve">The class discussion on failure ("Failing is hard, but not near as hard as learning from it") showed me that the error itself is often not the real damage. The damage comes from not admitting it: every week of carrying on adds time, money and credibility to a decision that is already wrong.</w:t>
       </w:r>
     </w:p>
     <w:p>

</xml_diff>